<commit_message>
Zielcheck statt „Heute habe ich gelernt“, Prüf-Kette statt Kreide-Kette (Mi 4.11. und Kurzeinheit angepasst)
Co-Authored-By: Claude Opus 5.5 <noreply@anthropic.com>
Claude-Session: https://claude.ai/code/session_01KXvLXHMYPnCyEbMRgNaaYs
</commit_message>
<xml_diff>
--- a/Deutsch_7A/Balladen/Woche2/Handreichung_Polnisch_04-11.docx
+++ b/Deutsch_7A/Balladen/Woche2/Handreichung_Polnisch_04-11.docx
@@ -1828,7 +1828,7 @@
           <w:sz w:val="20"/>
           <w:szCs w:val="20"/>
         </w:rPr>
-        <w:t xml:space="preserve">Zum Schluss: </w:t>
+        <w:t xml:space="preserve">Prüf-Kette: </w:t>
       </w:r>
       <w:r>
         <w:rPr>
@@ -1837,12 +1837,12 @@
           <w:sz w:val="20"/>
           <w:szCs w:val="20"/>
         </w:rPr>
-        <w:t xml:space="preserve">Heute habe ich gelernt, …</w:t>
-      </w:r>
-    </w:p>
-    <w:p>
-      <w:pPr>
-        <w:spacing w:after="0" w:before="0"/>
+        <w:t xml:space="preserve">Wer drankommt, prüft zuerst die Antwort davor (✓/✗ + Begründung) und schreibt dann die nächste an.</w:t>
+      </w:r>
+    </w:p>
+    <w:p>
+      <w:pPr>
+        <w:spacing w:after="40" w:before="0"/>
       </w:pPr>
       <w:r>
         <w:rPr>
@@ -1866,7 +1866,61 @@
           <w:sz w:val="19"/>
           <w:szCs w:val="19"/>
         </w:rPr>
-        <w:t xml:space="preserve">Na koniec zapisz w zeszycie: „Heute habe ich gelernt, …“ (Dziś nauczyłam się, …).</w:t>
+        <w:t xml:space="preserve">Kto jest wywołany, najpierw sprawdza odpowiedź poprzednika na tablicy (✓ albo ✗ + krótkie uzasadnienie), potem pisze następną. Wszyscy inni porównują ze swoim zeszytem i poprawiają na zielono.</w:t>
+      </w:r>
+    </w:p>
+    <w:p>
+      <w:pPr>
+        <w:spacing w:after="0" w:before="0"/>
+      </w:pPr>
+      <w:r>
+        <w:rPr>
+          <w:rFonts w:ascii="Calibri" w:cs="Calibri" w:eastAsia="Calibri" w:hAnsi="Calibri"/>
+          <w:b/>
+          <w:bCs/>
+          <w:color w:val="000000"/>
+          <w:sz w:val="20"/>
+          <w:szCs w:val="20"/>
+        </w:rPr>
+        <w:t xml:space="preserve">Zielcheck: </w:t>
+      </w:r>
+      <w:r>
+        <w:rPr>
+          <w:rFonts w:ascii="Calibri" w:cs="Calibri" w:eastAsia="Calibri" w:hAnsi="Calibri"/>
+          <w:color w:val="000000"/>
+          <w:sz w:val="20"/>
+          <w:szCs w:val="20"/>
+        </w:rPr>
+        <w:t xml:space="preserve">Löse die drei Aufgaben auf der Folie im Heft. Vergleiche dann mit der Lösung.</w:t>
+      </w:r>
+    </w:p>
+    <w:p>
+      <w:pPr>
+        <w:spacing w:after="0" w:before="0"/>
+      </w:pPr>
+      <w:r>
+        <w:rPr>
+          <w:rFonts w:ascii="Calibri" w:cs="Calibri" w:eastAsia="Calibri" w:hAnsi="Calibri"/>
+          <w:b/>
+          <w:bCs/>
+          <w:i w:val="false"/>
+          <w:iCs w:val="false"/>
+          <w:color w:val="5B4A8A"/>
+          <w:sz w:val="19"/>
+          <w:szCs w:val="19"/>
+        </w:rPr>
+        <w:t xml:space="preserve">PL: </w:t>
+      </w:r>
+      <w:r>
+        <w:rPr>
+          <w:rFonts w:ascii="Calibri" w:cs="Calibri" w:eastAsia="Calibri" w:hAnsi="Calibri"/>
+          <w:i/>
+          <w:iCs/>
+          <w:color w:val="5B4A8A"/>
+          <w:sz w:val="19"/>
+          <w:szCs w:val="19"/>
+        </w:rPr>
+        <w:t xml:space="preserve">Sprawdzenie celu: rozwiąż w zeszycie trzy krótkie zadania z prezentacji (1: dlaczego Szkot ucieka? 2 a: połącz zdania spójnikiem „als“; 2 b: czy zdanie jest poprawne? Uzasadnij). Potem porównaj z rozwiązaniem i popraw na zielono.</w:t>
       </w:r>
     </w:p>
     <w:sectPr>

</xml_diff>

<commit_message>
„Sprachtraining“ statt „Grammatik“ im Material für Mi 4.11.; Begriff in CLAUDE.md festgehalten
Co-Authored-By: Claude Opus 5.5 <noreply@anthropic.com>
Claude-Session: https://claude.ai/code/session_01KXvLXHMYPnCyEbMRgNaaYs
</commit_message>
<xml_diff>
--- a/Deutsch_7A/Balladen/Woche2/Handreichung_Polnisch_04-11.docx
+++ b/Deutsch_7A/Balladen/Woche2/Handreichung_Polnisch_04-11.docx
@@ -15,7 +15,7 @@
           <w:sz w:val="26"/>
           <w:szCs w:val="26"/>
         </w:rPr>
-        <w:t xml:space="preserve">Mittwoch, 4.11. · Paddy Fingal: Inhalt und Grammatik</w:t>
+        <w:t xml:space="preserve">Mittwoch, 4.11. · Paddy Fingal: Inhalt und Sprachtraining</w:t>
       </w:r>
       <w:r>
         <w:rPr>
@@ -965,7 +965,7 @@
           <w:sz w:val="22"/>
           <w:szCs w:val="22"/>
         </w:rPr>
-        <w:t xml:space="preserve">Teil 2 · Nebensätze mit Subjunktion</w:t>
+        <w:t xml:space="preserve">Teil 2 · Sprachtraining: Nebensätze mit Subjunktion</w:t>
       </w:r>
       <w:r>
         <w:rPr>
@@ -976,7 +976,7 @@
           <w:sz w:val="19"/>
           <w:szCs w:val="19"/>
         </w:rPr>
-        <w:t xml:space="preserve">   zdania podrzędne ze spójnikiem</w:t>
+        <w:t xml:space="preserve">   trening językowy: zdania podrzędne ze spójnikiem</w:t>
       </w:r>
     </w:p>
     <w:tbl>

</xml_diff>

<commit_message>
Mi 4.11.: Ü1 als Aussagen prüfen (AB), Aufdeck-Folien statt Tafelarbeit, Handreichung und Vokabelliste angepasst
Co-Authored-By: Claude Opus 5.5 <noreply@anthropic.com>
Claude-Session: https://claude.ai/code/session_01KXvLXHMYPnCyEbMRgNaaYs
</commit_message>
<xml_diff>
--- a/Deutsch_7A/Balladen/Woche2/Handreichung_Polnisch_04-11.docx
+++ b/Deutsch_7A/Balladen/Woche2/Handreichung_Polnisch_04-11.docx
@@ -53,7 +53,7 @@
           <w:sz w:val="20"/>
           <w:szCs w:val="20"/>
         </w:rPr>
-        <w:t xml:space="preserve">Ich kann Fragen zum Inhalt der Ballade mit Textbeleg beantworten.</w:t>
+        <w:t xml:space="preserve">Ich kann Aussagen zur Ballade prüfen und mit Textbelegen begründen, ob sie richtig oder falsch sind.</w:t>
       </w:r>
     </w:p>
     <w:p>
@@ -82,7 +82,7 @@
           <w:sz w:val="19"/>
           <w:szCs w:val="19"/>
         </w:rPr>
-        <w:t xml:space="preserve">Cel 1: Potrafię odpowiedzieć na pytania o treść ballady i podać dowód z tekstu (numer strofy).</w:t>
+        <w:t xml:space="preserve">Cel 1: Potrafię sprawdzić stwierdzenia o balladzie i uzasadnić dowodem z tekstu, czy są prawdziwe, czy fałszywe.</w:t>
       </w:r>
     </w:p>
     <w:p>
@@ -236,7 +236,7 @@
           <w:sz w:val="20"/>
           <w:szCs w:val="20"/>
         </w:rPr>
-        <w:t xml:space="preserve">Ü1 (LB 1 a): </w:t>
+        <w:t xml:space="preserve">Ü1 (Arbeitsblatt): </w:t>
       </w:r>
       <w:r>
         <w:rPr>
@@ -245,7 +245,7 @@
           <w:sz w:val="20"/>
           <w:szCs w:val="20"/>
         </w:rPr>
-        <w:t xml:space="preserve">Lest im Tandem. Beantwortet die drei Fragen im Heft in ganzen Sätzen, mit Strophe.</w:t>
+        <w:t xml:space="preserve">Prüfe jede Aussage: richtig oder falsch? Belege mit Strophe, Vers und Zitat. Ist sie falsch, schreibe: Richtig ist …</w:t>
       </w:r>
     </w:p>
     <w:p>
@@ -274,7 +274,7 @@
           <w:sz w:val="19"/>
           <w:szCs w:val="19"/>
         </w:rPr>
-        <w:t xml:space="preserve">Czytajcie w parze na zmianę: jedna osoba czyta strofę na głos, druga czyta po cichu i pomaga. Potem odpowiedz w zeszycie pełnymi zdaniami i podaj strofę.</w:t>
+        <w:t xml:space="preserve">Najpierw czytajcie w parze na zmianę (jedna osoba czyta strofę na głos, druga czyta po cichu i pomaga). Potem sama sprawdź każde zdanie na karcie pracy: prawda (richtig) czy fałsz (falsch)? Zapisz dowód: strofa (Str.), wers (V.), cytat. Jeśli zdanie jest fałszywe, napisz po niemiecku „Richtig ist: …“. Uwaga: zdania są napisane innymi słowami niż w balladzie.</w:t>
       </w:r>
     </w:p>
     <w:p>
@@ -303,7 +303,7 @@
           <w:sz w:val="19"/>
           <w:szCs w:val="19"/>
         </w:rPr>
-        <w:t xml:space="preserve">1 Wie sieht Paddy Fingal aus? – Jak wygląda Paddy Fingal?  ·  2 Was möchte der Riese aus Schottland von Paddy? – Czego chce olbrzym ze Szkocji od Paddy’ego?  ·  3 Welche List wendet Paddys Frau an? – Jakiego podstępu używa żona Paddy’ego?</w:t>
+        <w:t xml:space="preserve">1 Paddy jest tak silny, że rzuca masztem statku jak włócznią. · 2 Szkot przychodzi do Paddy’ego, bo chce go pozyskać jako sojusznika przeciw wrogowi. · 3 Kiedy Paddy widzi obcego z daleka, zauważa, że obaj są mniej więcej tego samego wzrostu. · 4 Paddy chce stanąć do walki i prosi Schayę, żeby pomogła mu się przygotować. · 5 Schaya prosi obcego, żeby był cicho, aby dziecko się nie obudziło. · 6 Szkot słucha ostrzeżenia Schai i trzyma się z daleka od łóżka. · 7 Szkot rozpoznaje Paddy’ego w łóżku i ucieka przed nim. · 8 Podczas ucieczki Szkot prawie stracił życie. · *9 Na końcu Paddy jest słusznie świętowany jako dzielny bohater, bo pokonał Szkota.</w:t>
       </w:r>
     </w:p>
     <w:tbl>
@@ -896,6 +896,149 @@
           </w:p>
         </w:tc>
       </w:tr>
+      <w:tr>
+        <w:trPr>
+          <w:cantSplit/>
+        </w:trPr>
+        <w:tc>
+          <w:tcPr>
+            <w:tcW w:type="dxa" w:w="2300"/>
+            <w:tcBorders>
+              <w:top w:val="single" w:color="C9D3EA" w:sz="6"/>
+              <w:left w:val="single" w:color="C9D3EA" w:sz="6"/>
+              <w:bottom w:val="single" w:color="C9D3EA" w:sz="6"/>
+              <w:right w:val="single" w:color="C9D3EA" w:sz="6"/>
+            </w:tcBorders>
+            <w:tcMar>
+              <w:top w:type="dxa" w:w="15"/>
+              <w:left w:type="dxa" w:w="60"/>
+              <w:bottom w:type="dxa" w:w="15"/>
+              <w:right w:type="dxa" w:w="100"/>
+            </w:tcMar>
+            <w:vAlign w:val="center"/>
+          </w:tcPr>
+          <w:p>
+            <w:pPr>
+              <w:spacing w:after="0" w:before="0"/>
+            </w:pPr>
+            <w:r>
+              <w:rPr>
+                <w:rFonts w:ascii="Calibri" w:cs="Calibri" w:eastAsia="Calibri" w:hAnsi="Calibri"/>
+                <w:b/>
+                <w:bCs/>
+                <w:color w:val="1E2761"/>
+                <w:sz w:val="19"/>
+                <w:szCs w:val="19"/>
+              </w:rPr>
+              <w:t xml:space="preserve">der Verbündete · der Speer</w:t>
+            </w:r>
+          </w:p>
+        </w:tc>
+        <w:tc>
+          <w:tcPr>
+            <w:tcW w:type="dxa" w:w="3233"/>
+            <w:tcBorders>
+              <w:top w:val="single" w:color="C9D3EA" w:sz="6"/>
+              <w:left w:val="single" w:color="C9D3EA" w:sz="6"/>
+              <w:bottom w:val="single" w:color="C9D3EA" w:sz="6"/>
+              <w:right w:val="single" w:color="C9D3EA" w:sz="6"/>
+            </w:tcBorders>
+            <w:shd w:fill="FBFCFF" w:color="auto" w:val="clear"/>
+            <w:tcMar>
+              <w:top w:type="dxa" w:w="15"/>
+              <w:left w:type="dxa" w:w="60"/>
+              <w:bottom w:type="dxa" w:w="15"/>
+              <w:right w:type="dxa" w:w="100"/>
+            </w:tcMar>
+            <w:vAlign w:val="center"/>
+          </w:tcPr>
+          <w:p>
+            <w:pPr>
+              <w:spacing w:after="0" w:before="0"/>
+            </w:pPr>
+            <w:r>
+              <w:rPr>
+                <w:rFonts w:ascii="Calibri" w:cs="Calibri" w:eastAsia="Calibri" w:hAnsi="Calibri"/>
+                <w:i w:val="false"/>
+                <w:iCs w:val="false"/>
+                <w:color w:val="333333"/>
+                <w:sz w:val="19"/>
+                <w:szCs w:val="19"/>
+              </w:rPr>
+              <w:t xml:space="preserve">sojusznik · włócznia</w:t>
+            </w:r>
+          </w:p>
+        </w:tc>
+        <w:tc>
+          <w:tcPr>
+            <w:tcW w:type="dxa" w:w="2300"/>
+            <w:tcBorders>
+              <w:top w:val="single" w:color="C9D3EA" w:sz="6"/>
+              <w:left w:val="single" w:color="C9D3EA" w:sz="6"/>
+              <w:bottom w:val="single" w:color="C9D3EA" w:sz="6"/>
+              <w:right w:val="single" w:color="C9D3EA" w:sz="6"/>
+            </w:tcBorders>
+            <w:tcMar>
+              <w:top w:type="dxa" w:w="15"/>
+              <w:left w:type="dxa" w:w="60"/>
+              <w:bottom w:type="dxa" w:w="15"/>
+              <w:right w:type="dxa" w:w="100"/>
+            </w:tcMar>
+            <w:vAlign w:val="center"/>
+          </w:tcPr>
+          <w:p>
+            <w:pPr>
+              <w:spacing w:after="0" w:before="0"/>
+            </w:pPr>
+            <w:r>
+              <w:rPr>
+                <w:rFonts w:ascii="Calibri" w:cs="Calibri" w:eastAsia="Calibri" w:hAnsi="Calibri"/>
+                <w:b/>
+                <w:bCs/>
+                <w:color w:val="1E2761"/>
+                <w:sz w:val="19"/>
+                <w:szCs w:val="19"/>
+              </w:rPr>
+              <w:t xml:space="preserve">ertrinken · zu Recht</w:t>
+            </w:r>
+          </w:p>
+        </w:tc>
+        <w:tc>
+          <w:tcPr>
+            <w:tcW w:type="dxa" w:w="3233"/>
+            <w:tcBorders>
+              <w:top w:val="single" w:color="C9D3EA" w:sz="6"/>
+              <w:left w:val="single" w:color="C9D3EA" w:sz="6"/>
+              <w:bottom w:val="single" w:color="C9D3EA" w:sz="6"/>
+              <w:right w:val="single" w:color="C9D3EA" w:sz="6"/>
+            </w:tcBorders>
+            <w:shd w:fill="FBFCFF" w:color="auto" w:val="clear"/>
+            <w:tcMar>
+              <w:top w:type="dxa" w:w="15"/>
+              <w:left w:type="dxa" w:w="60"/>
+              <w:bottom w:type="dxa" w:w="15"/>
+              <w:right w:type="dxa" w:w="100"/>
+            </w:tcMar>
+            <w:vAlign w:val="center"/>
+          </w:tcPr>
+          <w:p>
+            <w:pPr>
+              <w:spacing w:after="0" w:before="0"/>
+            </w:pPr>
+            <w:r>
+              <w:rPr>
+                <w:rFonts w:ascii="Calibri" w:cs="Calibri" w:eastAsia="Calibri" w:hAnsi="Calibri"/>
+                <w:i w:val="false"/>
+                <w:iCs w:val="false"/>
+                <w:color w:val="333333"/>
+                <w:sz w:val="19"/>
+                <w:szCs w:val="19"/>
+              </w:rPr>
+              <w:t xml:space="preserve">utonąć · słusznie</w:t>
+            </w:r>
+          </w:p>
+        </w:tc>
+      </w:tr>
     </w:tbl>
     <w:p>
       <w:pPr>
@@ -948,7 +1091,7 @@
           <w:sz w:val="19"/>
           <w:szCs w:val="19"/>
         </w:rPr>
-        <w:t xml:space="preserve">Opowiedzcie balladę własnymi słowami. Lista kontrolna: tytuł i autor · właściwa kolejność · niczego nie wymyślać · wszystkie ważne szczegóły.</w:t>
+        <w:t xml:space="preserve">Opowiedzcie balladę własnymi słowami (kartę pracy możesz wykorzystać jako ściągę). Lista kontrolna: tytuł i autor · właściwa kolejność · niczego nie wymyślać · wszystkie ważne szczegóły.</w:t>
       </w:r>
     </w:p>
     <w:p>
@@ -1828,7 +1971,7 @@
           <w:sz w:val="20"/>
           <w:szCs w:val="20"/>
         </w:rPr>
-        <w:t xml:space="preserve">Prüf-Kette: </w:t>
+        <w:t xml:space="preserve">Gemeinsam prüfen: </w:t>
       </w:r>
       <w:r>
         <w:rPr>
@@ -1837,7 +1980,7 @@
           <w:sz w:val="20"/>
           <w:szCs w:val="20"/>
         </w:rPr>
-        <w:t xml:space="preserve">Wer drankommt, prüft zuerst die Antwort davor (✓/✗ + Begründung) und schreibt dann die nächste an.</w:t>
+        <w:t xml:space="preserve">Wer drankommt, sagt: richtig oder falsch – und den Beleg. Dann wird aufgedeckt.</w:t>
       </w:r>
     </w:p>
     <w:p>
@@ -1866,7 +2009,7 @@
           <w:sz w:val="19"/>
           <w:szCs w:val="19"/>
         </w:rPr>
-        <w:t xml:space="preserve">Kto jest wywołany, najpierw sprawdza odpowiedź poprzednika na tablicy (✓ albo ✗ + krótkie uzasadnienie), potem pisze następną. Wszyscy inni porównują ze swoim zeszytem i poprawiają na zielono.</w:t>
+        <w:t xml:space="preserve">Sprawdzamy razem na prezentacji, zdanie po zdaniu. Osoba wywołana mówi: prawda czy fałsz i podaje dowód. Potem nauczyciel pokazuje rozwiązanie. Wszyscy poprawiają na zielono.</w:t>
       </w:r>
     </w:p>
     <w:p>
@@ -1920,7 +2063,7 @@
           <w:sz w:val="19"/>
           <w:szCs w:val="19"/>
         </w:rPr>
-        <w:t xml:space="preserve">Sprawdzenie celu: rozwiąż w zeszycie trzy krótkie zadania z prezentacji (1: dlaczego Szkot ucieka? 2 a: połącz zdania spójnikiem „als“; 2 b: czy zdanie jest poprawne? Uzasadnij). Potem porównaj z rozwiązaniem i popraw na zielono.</w:t>
+        <w:t xml:space="preserve">Sprawdzenie celu: rozwiąż w zeszycie trzy krótkie zadania z prezentacji (1: czy zdanie „Der Schotte flieht, weil Paddy ihn im Bett angreift“ jest prawdziwe? Podaj dowód. 2 a: połącz zdania spójnikiem „als“; 2 b: czy zdanie jest poprawne? Uzasadnij). Potem porównaj z rozwiązaniem i popraw na zielono.</w:t>
       </w:r>
     </w:p>
     <w:sectPr>

</xml_diff>

<commit_message>
Mi 4.11.: Aufbau und Belegen vor Ü2, Nacherzählen mit Stichwörtern, Sprachtraining gekürzt (Chat auf Donnerstag)
Co-Authored-By: Claude Opus 5.5 <noreply@anthropic.com>
Claude-Session: https://claude.ai/code/session_01KXvLXHMYPnCyEbMRgNaaYs
</commit_message>
<xml_diff>
--- a/Deutsch_7A/Balladen/Woche2/Handreichung_Polnisch_04-11.docx
+++ b/Deutsch_7A/Balladen/Woche2/Handreichung_Polnisch_04-11.docx
@@ -53,7 +53,7 @@
           <w:sz w:val="20"/>
           <w:szCs w:val="20"/>
         </w:rPr>
-        <w:t xml:space="preserve">Ich kann Aussagen zur Ballade prüfen und mit Textbelegen begründen, ob sie richtig oder falsch sind.</w:t>
+        <w:t xml:space="preserve">Ich kann mit Strophe und Vers belegen, ob Aussagen zur Ballade richtig oder falsch sind.</w:t>
       </w:r>
     </w:p>
     <w:p>
@@ -82,7 +82,7 @@
           <w:sz w:val="19"/>
           <w:szCs w:val="19"/>
         </w:rPr>
-        <w:t xml:space="preserve">Cel 1: Potrafię sprawdzić stwierdzenia o balladzie i uzasadnić dowodem z tekstu, czy są prawdziwe, czy fałszywe.</w:t>
+        <w:t xml:space="preserve">Cel 1: Potrafię za pomocą strofy i wersu udowodnić, czy stwierdzenia o balladzie są prawdziwe, czy fałszywe.</w:t>
       </w:r>
     </w:p>
     <w:p>
@@ -236,7 +236,7 @@
           <w:sz w:val="20"/>
           <w:szCs w:val="20"/>
         </w:rPr>
-        <w:t xml:space="preserve">Ü1 (Arbeitsblatt): </w:t>
+        <w:t xml:space="preserve">Tandemlesen: </w:t>
       </w:r>
       <w:r>
         <w:rPr>
@@ -245,12 +245,12 @@
           <w:sz w:val="20"/>
           <w:szCs w:val="20"/>
         </w:rPr>
-        <w:t xml:space="preserve">Prüfe jede Aussage: richtig oder falsch? Belege mit Strophe, Vers und Zitat. Ist sie falsch, schreibe: Richtig ist …</w:t>
-      </w:r>
-    </w:p>
-    <w:p>
-      <w:pPr>
-        <w:spacing w:after="10" w:before="0"/>
+        <w:t xml:space="preserve">Lest die Ballade im Tandem, Strophe für Strophe.</w:t>
+      </w:r>
+    </w:p>
+    <w:p>
+      <w:pPr>
+        <w:spacing w:after="40" w:before="0"/>
       </w:pPr>
       <w:r>
         <w:rPr>
@@ -274,7 +274,32 @@
           <w:sz w:val="19"/>
           <w:szCs w:val="19"/>
         </w:rPr>
-        <w:t xml:space="preserve">Najpierw czytajcie w parze na zmianę (jedna osoba czyta strofę na głos, druga czyta po cichu i pomaga). Potem sama sprawdź każde zdanie na karcie pracy: prawda (richtig) czy fałsz (falsch)? Zapisz dowód: strofa (Str.), wers (V.), cytat. Jeśli zdanie jest fałszywe, napisz po niemiecku „Richtig ist: …“. Uwaga: zdania są napisane innymi słowami niż w balladzie.</w:t>
+        <w:t xml:space="preserve">Czytajcie w parze na zmianę: jedna osoba czyta strofę na głos, druga czyta po cichu i pomaga. Zwróć uwagę: co się dzieje? Kto działa?</w:t>
+      </w:r>
+    </w:p>
+    <w:p>
+      <w:pPr>
+        <w:spacing w:after="0" w:before="0"/>
+      </w:pPr>
+      <w:r>
+        <w:rPr>
+          <w:rFonts w:ascii="Calibri" w:cs="Calibri" w:eastAsia="Calibri" w:hAnsi="Calibri"/>
+          <w:b/>
+          <w:bCs/>
+          <w:color w:val="000000"/>
+          <w:sz w:val="20"/>
+          <w:szCs w:val="20"/>
+        </w:rPr>
+        <w:t xml:space="preserve">Aufbau: </w:t>
+      </w:r>
+      <w:r>
+        <w:rPr>
+          <w:rFonts w:ascii="Calibri" w:cs="Calibri" w:eastAsia="Calibri" w:hAnsi="Calibri"/>
+          <w:color w:val="000000"/>
+          <w:sz w:val="20"/>
+          <w:szCs w:val="20"/>
+        </w:rPr>
+        <w:t xml:space="preserve">Strophe = ein Abschnitt · Vers = eine Zeile · Beleg: Str. 1, V. 2: „Sechs Ellen flog sein schwarzer Bart“</w:t>
       </w:r>
     </w:p>
     <w:p>
@@ -303,7 +328,115 @@
           <w:sz w:val="19"/>
           <w:szCs w:val="19"/>
         </w:rPr>
-        <w:t xml:space="preserve">1 Paddy jest tak silny, że rzuca masztem statku jak włócznią. · 2 Szkot przychodzi do Paddy’ego, bo chce go pozyskać jako sojusznika przeciw wrogowi. · 3 Kiedy Paddy widzi obcego z daleka, zauważa, że obaj są mniej więcej tego samego wzrostu. · 4 Paddy chce stanąć do walki i prosi Schayę, żeby pomogła mu się przygotować. · 5 Schaya prosi obcego, żeby był cicho, aby dziecko się nie obudziło. · 6 Szkot słucha ostrzeżenia Schai i trzyma się z daleka od łóżka. · 7 Szkot rozpoznaje Paddy’ego w łóżku i ucieka przed nim. · 8 Podczas ucieczki Szkot prawie stracił życie. · *9 Na końcu Paddy jest słusznie świętowany jako dzielny bohater, bo pokonał Szkota.</w:t>
+        <w:t xml:space="preserve">Budowa ballady: strofa (Strophe) to fragment, między strofami jest pusta linijka. Wers (Vers) to jedna linijka – w podręczniku numery wersów są na marginesie (5, 10, 15 …). Dowód (Beleg) = strofa + wers + cytat w cudzysłowie.</w:t>
+      </w:r>
+    </w:p>
+    <w:p>
+      <w:pPr>
+        <w:spacing w:after="0" w:before="0"/>
+      </w:pPr>
+      <w:r>
+        <w:rPr>
+          <w:rFonts w:ascii="Calibri" w:cs="Calibri" w:eastAsia="Calibri" w:hAnsi="Calibri"/>
+          <w:b/>
+          <w:bCs/>
+          <w:color w:val="000000"/>
+          <w:sz w:val="20"/>
+          <w:szCs w:val="20"/>
+        </w:rPr>
+        <w:t xml:space="preserve">Ü1: </w:t>
+      </w:r>
+      <w:r>
+        <w:rPr>
+          <w:rFonts w:ascii="Calibri" w:cs="Calibri" w:eastAsia="Calibri" w:hAnsi="Calibri"/>
+          <w:color w:val="000000"/>
+          <w:sz w:val="20"/>
+          <w:szCs w:val="20"/>
+        </w:rPr>
+        <w:t xml:space="preserve">Belege finden: Zähle Strophen und Verse. Schlage Str. 3, V. 14 nach. Suche „birg mich im Versteck“.</w:t>
+      </w:r>
+    </w:p>
+    <w:p>
+      <w:pPr>
+        <w:spacing w:after="40" w:before="0"/>
+      </w:pPr>
+      <w:r>
+        <w:rPr>
+          <w:rFonts w:ascii="Calibri" w:cs="Calibri" w:eastAsia="Calibri" w:hAnsi="Calibri"/>
+          <w:b/>
+          <w:bCs/>
+          <w:i w:val="false"/>
+          <w:iCs w:val="false"/>
+          <w:color w:val="5B4A8A"/>
+          <w:sz w:val="19"/>
+          <w:szCs w:val="19"/>
+        </w:rPr>
+        <w:t xml:space="preserve">PL: </w:t>
+      </w:r>
+      <w:r>
+        <w:rPr>
+          <w:rFonts w:ascii="Calibri" w:cs="Calibri" w:eastAsia="Calibri" w:hAnsi="Calibri"/>
+          <w:i/>
+          <w:iCs/>
+          <w:color w:val="5B4A8A"/>
+          <w:sz w:val="19"/>
+          <w:szCs w:val="19"/>
+        </w:rPr>
+        <w:t xml:space="preserve">Policz strofy i wersy w strofie. Sprawdź, co jest w strofie 3, wersie 14, i przepisz cytat. Znajdź „birg mich im Versteck“ i podaj strofę i wers.</w:t>
+      </w:r>
+    </w:p>
+    <w:p>
+      <w:pPr>
+        <w:spacing w:after="0" w:before="0"/>
+      </w:pPr>
+      <w:r>
+        <w:rPr>
+          <w:rFonts w:ascii="Calibri" w:cs="Calibri" w:eastAsia="Calibri" w:hAnsi="Calibri"/>
+          <w:b/>
+          <w:bCs/>
+          <w:color w:val="000000"/>
+          <w:sz w:val="20"/>
+          <w:szCs w:val="20"/>
+        </w:rPr>
+        <w:t xml:space="preserve">Ü2 (Arbeitsblatt): </w:t>
+      </w:r>
+      <w:r>
+        <w:rPr>
+          <w:rFonts w:ascii="Calibri" w:cs="Calibri" w:eastAsia="Calibri" w:hAnsi="Calibri"/>
+          <w:color w:val="000000"/>
+          <w:sz w:val="20"/>
+          <w:szCs w:val="20"/>
+        </w:rPr>
+        <w:t xml:space="preserve">Prüfe jede Aussage: richtig oder falsch? Belege mit Strophe, Vers und Zitat. Ist sie falsch, schreibe: Richtig ist …</w:t>
+      </w:r>
+    </w:p>
+    <w:p>
+      <w:pPr>
+        <w:spacing w:after="40" w:before="0"/>
+      </w:pPr>
+      <w:r>
+        <w:rPr>
+          <w:rFonts w:ascii="Calibri" w:cs="Calibri" w:eastAsia="Calibri" w:hAnsi="Calibri"/>
+          <w:b/>
+          <w:bCs/>
+          <w:i w:val="false"/>
+          <w:iCs w:val="false"/>
+          <w:color w:val="5B4A8A"/>
+          <w:sz w:val="19"/>
+          <w:szCs w:val="19"/>
+        </w:rPr>
+        <w:t xml:space="preserve">PL: </w:t>
+      </w:r>
+      <w:r>
+        <w:rPr>
+          <w:rFonts w:ascii="Calibri" w:cs="Calibri" w:eastAsia="Calibri" w:hAnsi="Calibri"/>
+          <w:i/>
+          <w:iCs/>
+          <w:color w:val="5B4A8A"/>
+          <w:sz w:val="19"/>
+          <w:szCs w:val="19"/>
+        </w:rPr>
+        <w:t xml:space="preserve">Masz kartę pracy w dwóch językach. Sama sprawdź każde zdanie: prawda (richtig) czy fałsz (falsch)? Podaj dowód. Jeśli zdanie jest fałszywe, napisz po niemiecku „Richtig ist: …“.</w:t>
       </w:r>
     </w:p>
     <w:tbl>
@@ -1053,7 +1186,7 @@
           <w:sz w:val="20"/>
           <w:szCs w:val="20"/>
         </w:rPr>
-        <w:t xml:space="preserve">* Ü1 b: </w:t>
+        <w:t xml:space="preserve">* Ü3: </w:t>
       </w:r>
       <w:r>
         <w:rPr>
@@ -1062,7 +1195,7 @@
           <w:sz w:val="20"/>
           <w:szCs w:val="20"/>
         </w:rPr>
-        <w:t xml:space="preserve">Erzählt die Ballade nach (A: Str. 1–5, B: Str. 6–11).</w:t>
+        <w:t xml:space="preserve">Erzählt die Ballade nach. Nutzt die Stichwörter auf der Folie (A: Abschnitt 1–4, B: 5–8).</w:t>
       </w:r>
     </w:p>
     <w:p>
@@ -1091,7 +1224,7 @@
           <w:sz w:val="19"/>
           <w:szCs w:val="19"/>
         </w:rPr>
-        <w:t xml:space="preserve">Opowiedzcie balladę własnymi słowami (kartę pracy możesz wykorzystać jako ściągę). Lista kontrolna: tytuł i autor · właściwa kolejność · niczego nie wymyślać · wszystkie ważne szczegóły.</w:t>
+        <w:t xml:space="preserve">Opowiedzcie balladę własnymi słowami. Na prezentacji jest początek („In der Ballade … geht es um …“) i 8 części ze słowami-kluczami – one wyznaczają kolejność. Łącz zdania słowami: zuerst (najpierw), dann (potem), als (kiedy), weil (ponieważ), schließlich (w końcu). Lista kontrolna: tytuł i autor · właściwa kolejność · niczego nie wymyślać · wszystkie ważne szczegóły.</w:t>
       </w:r>
     </w:p>
     <w:p>
@@ -1755,7 +1888,7 @@
           <w:sz w:val="20"/>
           <w:szCs w:val="20"/>
         </w:rPr>
-        <w:t xml:space="preserve">Ü2: </w:t>
+        <w:t xml:space="preserve">Ü4: </w:t>
       </w:r>
       <w:r>
         <w:rPr>
@@ -1809,7 +1942,7 @@
           <w:sz w:val="20"/>
           <w:szCs w:val="20"/>
         </w:rPr>
-        <w:t xml:space="preserve">Ü3: </w:t>
+        <w:t xml:space="preserve">Ü5: </w:t>
       </w:r>
       <w:r>
         <w:rPr>
@@ -1863,7 +1996,7 @@
           <w:sz w:val="20"/>
           <w:szCs w:val="20"/>
         </w:rPr>
-        <w:t xml:space="preserve">Ü4: </w:t>
+        <w:t xml:space="preserve">* Ü6: </w:t>
       </w:r>
       <w:r>
         <w:rPr>
@@ -1872,7 +2005,7 @@
           <w:sz w:val="20"/>
           <w:szCs w:val="20"/>
         </w:rPr>
-        <w:t xml:space="preserve">Finde im Chat die Fehler. Schreibe die Sätze richtig. Notiere: Verbstellung oder Komma?</w:t>
+        <w:t xml:space="preserve">Schreibe Sätze über die Ballade mit den Satzanfängen.</w:t>
       </w:r>
     </w:p>
     <w:p>
@@ -1901,7 +2034,7 @@
           <w:sz w:val="19"/>
           <w:szCs w:val="19"/>
         </w:rPr>
-        <w:t xml:space="preserve">W czacie są błędy. Napisz zdania poprawnie i zanotuj, czy błąd dotyczy szyku czasownika (Verbstellung), czy przecinka (Komma).</w:t>
+        <w:t xml:space="preserve">Dokończ zdania o balladzie, np. „Der Schotte flieht, weil …“ (Szkot ucieka, ponieważ …). Pamiętaj: czasownik na końcu.</w:t>
       </w:r>
     </w:p>
     <w:p>
@@ -1917,7 +2050,7 @@
           <w:sz w:val="20"/>
           <w:szCs w:val="20"/>
         </w:rPr>
-        <w:t xml:space="preserve">* Ü5: </w:t>
+        <w:t xml:space="preserve">Gemeinsam prüfen: </w:t>
       </w:r>
       <w:r>
         <w:rPr>
@@ -1926,7 +2059,7 @@
           <w:sz w:val="20"/>
           <w:szCs w:val="20"/>
         </w:rPr>
-        <w:t xml:space="preserve">Schreibe Sätze über die Ballade mit den Satzanfängen.</w:t>
+        <w:t xml:space="preserve">Wer drankommt, sagt: richtig oder falsch – und den Beleg. Dann wird aufgedeckt.</w:t>
       </w:r>
     </w:p>
     <w:p>
@@ -1955,7 +2088,7 @@
           <w:sz w:val="19"/>
           <w:szCs w:val="19"/>
         </w:rPr>
-        <w:t xml:space="preserve">Dokończ zdania o balladzie, np. „Der Schotte flieht, weil …“ (Szkot ucieka, ponieważ …). Pamiętaj: czasownik na końcu.</w:t>
+        <w:t xml:space="preserve">Sprawdzamy razem na prezentacji, zdanie po zdaniu. Osoba wywołana mówi: prawda czy fałsz i podaje dowód. Potem nauczyciel pokazuje rozwiązanie. Wszyscy poprawiają na zielono.</w:t>
       </w:r>
     </w:p>
     <w:p>
@@ -1971,7 +2104,7 @@
           <w:sz w:val="20"/>
           <w:szCs w:val="20"/>
         </w:rPr>
-        <w:t xml:space="preserve">Gemeinsam prüfen: </w:t>
+        <w:t xml:space="preserve">Zielcheck: </w:t>
       </w:r>
       <w:r>
         <w:rPr>
@@ -1980,12 +2113,12 @@
           <w:sz w:val="20"/>
           <w:szCs w:val="20"/>
         </w:rPr>
-        <w:t xml:space="preserve">Wer drankommt, sagt: richtig oder falsch – und den Beleg. Dann wird aufgedeckt.</w:t>
-      </w:r>
-    </w:p>
-    <w:p>
-      <w:pPr>
-        <w:spacing w:after="40" w:before="0"/>
+        <w:t xml:space="preserve">Löse die drei Aufgaben auf der Folie im Heft. Vergleiche dann mit der Lösung.</w:t>
+      </w:r>
+    </w:p>
+    <w:p>
+      <w:pPr>
+        <w:spacing w:after="0" w:before="0"/>
       </w:pPr>
       <w:r>
         <w:rPr>
@@ -2009,61 +2142,7 @@
           <w:sz w:val="19"/>
           <w:szCs w:val="19"/>
         </w:rPr>
-        <w:t xml:space="preserve">Sprawdzamy razem na prezentacji, zdanie po zdaniu. Osoba wywołana mówi: prawda czy fałsz i podaje dowód. Potem nauczyciel pokazuje rozwiązanie. Wszyscy poprawiają na zielono.</w:t>
-      </w:r>
-    </w:p>
-    <w:p>
-      <w:pPr>
-        <w:spacing w:after="0" w:before="0"/>
-      </w:pPr>
-      <w:r>
-        <w:rPr>
-          <w:rFonts w:ascii="Calibri" w:cs="Calibri" w:eastAsia="Calibri" w:hAnsi="Calibri"/>
-          <w:b/>
-          <w:bCs/>
-          <w:color w:val="000000"/>
-          <w:sz w:val="20"/>
-          <w:szCs w:val="20"/>
-        </w:rPr>
-        <w:t xml:space="preserve">Zielcheck: </w:t>
-      </w:r>
-      <w:r>
-        <w:rPr>
-          <w:rFonts w:ascii="Calibri" w:cs="Calibri" w:eastAsia="Calibri" w:hAnsi="Calibri"/>
-          <w:color w:val="000000"/>
-          <w:sz w:val="20"/>
-          <w:szCs w:val="20"/>
-        </w:rPr>
-        <w:t xml:space="preserve">Löse die drei Aufgaben auf der Folie im Heft. Vergleiche dann mit der Lösung.</w:t>
-      </w:r>
-    </w:p>
-    <w:p>
-      <w:pPr>
-        <w:spacing w:after="0" w:before="0"/>
-      </w:pPr>
-      <w:r>
-        <w:rPr>
-          <w:rFonts w:ascii="Calibri" w:cs="Calibri" w:eastAsia="Calibri" w:hAnsi="Calibri"/>
-          <w:b/>
-          <w:bCs/>
-          <w:i w:val="false"/>
-          <w:iCs w:val="false"/>
-          <w:color w:val="5B4A8A"/>
-          <w:sz w:val="19"/>
-          <w:szCs w:val="19"/>
-        </w:rPr>
-        <w:t xml:space="preserve">PL: </w:t>
-      </w:r>
-      <w:r>
-        <w:rPr>
-          <w:rFonts w:ascii="Calibri" w:cs="Calibri" w:eastAsia="Calibri" w:hAnsi="Calibri"/>
-          <w:i/>
-          <w:iCs/>
-          <w:color w:val="5B4A8A"/>
-          <w:sz w:val="19"/>
-          <w:szCs w:val="19"/>
-        </w:rPr>
-        <w:t xml:space="preserve">Sprawdzenie celu: rozwiąż w zeszycie trzy krótkie zadania z prezentacji (1: czy zdanie „Der Schotte flieht, weil Paddy ihn im Bett angreift“ jest prawdziwe? Podaj dowód. 2 a: połącz zdania spójnikiem „als“; 2 b: czy zdanie jest poprawne? Uzasadnij). Potem porównaj z rozwiązaniem i popraw na zielono.</w:t>
+        <w:t xml:space="preserve">Sprawdzenie celu: rozwiąż w zeszycie trzy krótkie zadania z prezentacji (1: czy zdanie „Der Schotte flieht, weil Paddy ihn im Bett angreift“ jest prawdziwe? Podaj strofę i wers. 2 a: połącz zdania spójnikiem „als“; 2 b: czy zdanie jest poprawne? Uzasadnij). Potem porównaj z rozwiązaniem i popraw na zielono.</w:t>
       </w:r>
     </w:p>
     <w:sectPr>

</xml_diff>